<commit_message>
alterando links do curriculo
</commit_message>
<xml_diff>
--- a/ALVARO.MARTINS-EN.docx
+++ b/ALVARO.MARTINS-EN.docx
@@ -228,29 +228,7 @@
           <w:szCs w:val="21"/>
           <w:rtl w:val="0"/>
         </w:rPr>
-        <w:t xml:space="preserve">cript, </w:t>
-      </w:r>
-      <w:r>
-        <w:rPr>
-          <w:rFonts w:ascii="Garamond" w:cs="Garamond" w:eastAsia="Garamond" w:hAnsi="Garamond"/>
-          <w:b w:val="1"/>
-          <w:bCs w:val="1"/>
-          <w:sz w:val="21"/>
-          <w:szCs w:val="21"/>
-          <w:rtl w:val="0"/>
-        </w:rPr>
-        <w:t xml:space="preserve">Next.js</w:t>
-      </w:r>
-      <w:r>
-        <w:rPr>
-          <w:rFonts w:ascii="Garamond" w:cs="Garamond" w:eastAsia="Garamond" w:hAnsi="Garamond"/>
-          <w:b w:val="1"/>
-          <w:bCs w:val="1"/>
-          <w:sz w:val="21"/>
-          <w:szCs w:val="21"/>
-          <w:rtl w:val="0"/>
-        </w:rPr>
-        <w:t xml:space="preserve">, React, Node.js, and Python</w:t>
+        <w:t xml:space="preserve">cript, Next.js, React, Node.js, and Python</w:t>
       </w:r>
       <w:r>
         <w:rPr>
@@ -482,7 +460,7 @@
           <w:ilvl w:val="0"/>
           <w:numId w:val="1"/>
         </w:numPr>
-        <w:spacing w:after="0" w:afterAutospacing="0" w:before="0" w:line="240" w:lineRule="auto"/>
+        <w:spacing w:after="0" w:before="0" w:line="240" w:lineRule="auto"/>
         <w:ind w:left="720" w:hanging="360"/>
         <w:rPr>
           <w:rFonts w:ascii="Garamond" w:cs="Garamond" w:eastAsia="Garamond" w:hAnsi="Garamond"/>
@@ -512,7 +490,7 @@
           <w:ilvl w:val="0"/>
           <w:numId w:val="1"/>
         </w:numPr>
-        <w:spacing w:after="0" w:afterAutospacing="0" w:before="0" w:line="240" w:lineRule="auto"/>
+        <w:spacing w:after="0" w:before="0" w:line="240" w:lineRule="auto"/>
         <w:ind w:left="720" w:hanging="360"/>
         <w:rPr>
           <w:rFonts w:ascii="Garamond" w:cs="Garamond" w:eastAsia="Garamond" w:hAnsi="Garamond"/>
@@ -529,6 +507,11 @@
           <w:rtl w:val="0"/>
         </w:rPr>
         <w:t xml:space="preserve">Endpoint Security (Cisco Networking Academy);</w:t>
+      </w:r>
+      <w:r>
+        <w:rPr>
+          <w:rtl w:val="0"/>
+        </w:rPr>
       </w:r>
     </w:p>
     <w:p>
@@ -537,7 +520,7 @@
           <w:ilvl w:val="0"/>
           <w:numId w:val="1"/>
         </w:numPr>
-        <w:spacing w:after="0" w:afterAutospacing="0" w:before="0" w:line="240" w:lineRule="auto"/>
+        <w:spacing w:after="0" w:before="0" w:line="240" w:lineRule="auto"/>
         <w:ind w:left="720" w:hanging="360"/>
         <w:rPr>
           <w:rFonts w:ascii="Garamond" w:cs="Garamond" w:eastAsia="Garamond" w:hAnsi="Garamond"/>
@@ -899,11 +882,6 @@
           <w:rtl w:val="0"/>
         </w:rPr>
         <w:t xml:space="preserve">Production and editing of audiovisual content for digital channels.</w:t>
-      </w:r>
-      <w:r>
-        <w:rPr>
-          <w:rtl w:val="0"/>
-        </w:rPr>
       </w:r>
     </w:p>
     <w:p>
@@ -1417,11 +1395,6 @@
         </w:rPr>
         <w:t xml:space="preserve">Administrative panel with authentication and access control for content management.</w:t>
       </w:r>
-      <w:r>
-        <w:rPr>
-          <w:rtl w:val="0"/>
-        </w:rPr>
-      </w:r>
     </w:p>
     <w:p>
       <w:pPr>
@@ -1451,11 +1424,6 @@
           <w:rtl w:val="0"/>
         </w:rPr>
         <w:t xml:space="preserve">Tracks site visits, clicks, and time spent on pages.</w:t>
-      </w:r>
-      <w:r>
-        <w:rPr>
-          <w:rtl w:val="0"/>
-        </w:rPr>
       </w:r>
     </w:p>
     <w:p>
@@ -2361,6 +2329,20 @@
       <w:sz w:val="52"/>
       <w:szCs w:val="52"/>
     </w:rPr>
+  </w:style>
+  <w:style w:type="table" w:styleId="TableNormal" w:default="1">
+    <w:name w:val="TableNormal"/>
+    <w:tblPr>
+      <w:tblCellMar>
+        <w:top w:w="100.0" w:type="dxa"/>
+        <w:left w:w="100.0" w:type="dxa"/>
+        <w:bottom w:w="100.0" w:type="dxa"/>
+        <w:right w:w="100.0" w:type="dxa"/>
+      </w:tblCellMar>
+    </w:tblPr>
+  </w:style>
+  <w:style w:type="paragraph" w:styleId="Normal" w:default="1">
+    <w:name w:val="normal"/>
   </w:style>
   <w:style w:type="paragraph" w:styleId="Header">
     <w:name w:val="header"/>
@@ -14198,7 +14180,7 @@
 
 <file path=customXML/item1.xml><?xml version="1.0" encoding="utf-8"?>
 <go:gDocsCustomXmlDataStorage xmlns:go="http://customooxmlschemas.google.com/" xmlns:r="http://schemas.openxmlformats.org/officeDocument/2006/relationships" uri="GoogleDocsCustomDataVersion2">
-  <go:docsCustomData xmlns:go="http://customooxmlschemas.google.com/" roundtripDataSignature="AMtx7mhJj5o+HrwrTXbgcMr+/GF8PLRd/g==">CgMxLjA4AHIhMWxVem94MkU2MVh5TWF5aUtFdlUxbkE2Vm9JT1JvUDIx</go:docsCustomData>
+  <go:docsCustomData xmlns:go="http://customooxmlschemas.google.com/" roundtripDataSignature="AMtx7miKyDPy0/mOp/FKr9g3CXoLKcGahQ==">CgMxLjA4AHIhMVp1YktPMkxJOFFDOGN0Z2lrWm9TMDdxSTRFcHhrTnpx</go:docsCustomData>
 </go:gDocsCustomXmlDataStorage>
 </file>
 

</xml_diff>